<commit_message>
Update list of table
Update list of table
</commit_message>
<xml_diff>
--- a/BRD_DWH_Data_Retention_v0.1.docx
+++ b/BRD_DWH_Data_Retention_v0.1.docx
@@ -5113,7 +5113,12 @@
               <w:tab w:val="right" w:leader="dot" w:pos="9628"/>
             </w:tabs>
             <w:rPr>
+              <w:rFonts w:asciiTheme="minorHAnsi" w:eastAsiaTheme="minorEastAsia" w:hAnsiTheme="minorHAnsi" w:cstheme="minorBidi"/>
               <w:noProof/>
+              <w:kern w:val="2"/>
+              <w:sz w:val="24"/>
+              <w:szCs w:val="24"/>
+              <w14:ligatures w14:val="standardContextual"/>
             </w:rPr>
           </w:pPr>
           <w:r>
@@ -5125,7 +5130,7 @@
           <w:r>
             <w:fldChar w:fldCharType="separate"/>
           </w:r>
-          <w:hyperlink w:anchor="_Toc244011608" w:history="1">
+          <w:hyperlink w:anchor="_Toc244206671" w:history="1">
             <w:r>
               <w:rPr>
                 <w:rStyle w:val="Hyperlink"/>
@@ -5149,7 +5154,7 @@
               <w:rPr>
                 <w:noProof/>
               </w:rPr>
-              <w:instrText xml:space="preserve"> PAGEREF _Toc244011608 \h </w:instrText>
+              <w:instrText xml:space="preserve"> PAGEREF _Toc244206671 \h </w:instrText>
             </w:r>
             <w:r>
               <w:rPr>
@@ -5166,7 +5171,7 @@
               <w:rPr>
                 <w:noProof/>
               </w:rPr>
-              <w:t>11</w:t>
+              <w:t>9</w:t>
             </w:r>
             <w:r>
               <w:rPr>
@@ -5183,10 +5188,15 @@
               <w:tab w:val="right" w:leader="dot" w:pos="9628"/>
             </w:tabs>
             <w:rPr>
+              <w:rFonts w:asciiTheme="minorHAnsi" w:eastAsiaTheme="minorEastAsia" w:hAnsiTheme="minorHAnsi" w:cstheme="minorBidi"/>
               <w:noProof/>
+              <w:kern w:val="2"/>
+              <w:sz w:val="24"/>
+              <w:szCs w:val="24"/>
+              <w14:ligatures w14:val="standardContextual"/>
             </w:rPr>
           </w:pPr>
-          <w:hyperlink w:anchor="_Toc244011609" w:history="1">
+          <w:hyperlink w:anchor="_Toc244206672" w:history="1">
             <w:r>
               <w:rPr>
                 <w:rStyle w:val="Hyperlink"/>
@@ -5210,7 +5220,7 @@
               <w:rPr>
                 <w:noProof/>
               </w:rPr>
-              <w:instrText xml:space="preserve"> PAGEREF _Toc244011609 \h </w:instrText>
+              <w:instrText xml:space="preserve"> PAGEREF _Toc244206672 \h </w:instrText>
             </w:r>
             <w:r>
               <w:rPr>
@@ -5227,7 +5237,7 @@
               <w:rPr>
                 <w:noProof/>
               </w:rPr>
-              <w:t>12</w:t>
+              <w:t>10</w:t>
             </w:r>
             <w:r>
               <w:rPr>
@@ -5244,10 +5254,15 @@
               <w:tab w:val="right" w:leader="dot" w:pos="9628"/>
             </w:tabs>
             <w:rPr>
+              <w:rFonts w:asciiTheme="minorHAnsi" w:eastAsiaTheme="minorEastAsia" w:hAnsiTheme="minorHAnsi" w:cstheme="minorBidi"/>
               <w:noProof/>
+              <w:kern w:val="2"/>
+              <w:sz w:val="24"/>
+              <w:szCs w:val="24"/>
+              <w14:ligatures w14:val="standardContextual"/>
             </w:rPr>
           </w:pPr>
-          <w:hyperlink w:anchor="_Toc244011610" w:history="1">
+          <w:hyperlink w:anchor="_Toc244206673" w:history="1">
             <w:r>
               <w:rPr>
                 <w:rStyle w:val="Hyperlink"/>
@@ -5271,7 +5286,7 @@
               <w:rPr>
                 <w:noProof/>
               </w:rPr>
-              <w:instrText xml:space="preserve"> PAGEREF _Toc244011610 \h </w:instrText>
+              <w:instrText xml:space="preserve"> PAGEREF _Toc244206673 \h </w:instrText>
             </w:r>
             <w:r>
               <w:rPr>
@@ -5288,7 +5303,7 @@
               <w:rPr>
                 <w:noProof/>
               </w:rPr>
-              <w:t>14</w:t>
+              <w:t>12</w:t>
             </w:r>
             <w:r>
               <w:rPr>
@@ -5305,10 +5320,15 @@
               <w:tab w:val="right" w:leader="dot" w:pos="9628"/>
             </w:tabs>
             <w:rPr>
+              <w:rFonts w:asciiTheme="minorHAnsi" w:eastAsiaTheme="minorEastAsia" w:hAnsiTheme="minorHAnsi" w:cstheme="minorBidi"/>
               <w:noProof/>
+              <w:kern w:val="2"/>
+              <w:sz w:val="24"/>
+              <w:szCs w:val="24"/>
+              <w14:ligatures w14:val="standardContextual"/>
             </w:rPr>
           </w:pPr>
-          <w:hyperlink w:anchor="_Toc244011611" w:history="1">
+          <w:hyperlink w:anchor="_Toc244206674" w:history="1">
             <w:r>
               <w:rPr>
                 <w:rStyle w:val="Hyperlink"/>
@@ -5332,7 +5352,7 @@
               <w:rPr>
                 <w:noProof/>
               </w:rPr>
-              <w:instrText xml:space="preserve"> PAGEREF _Toc244011611 \h </w:instrText>
+              <w:instrText xml:space="preserve"> PAGEREF _Toc244206674 \h </w:instrText>
             </w:r>
             <w:r>
               <w:rPr>
@@ -5349,7 +5369,7 @@
               <w:rPr>
                 <w:noProof/>
               </w:rPr>
-              <w:t>15</w:t>
+              <w:t>13</w:t>
             </w:r>
             <w:r>
               <w:rPr>
@@ -5411,7 +5431,7 @@
           <w:r>
             <w:fldChar w:fldCharType="separate"/>
           </w:r>
-          <w:hyperlink w:anchor="_Toc244011612" w:history="1">
+          <w:hyperlink w:anchor="_Toc244206653" w:history="1">
             <w:r>
               <w:rPr>
                 <w:rStyle w:val="Hyperlink"/>
@@ -5435,7 +5455,7 @@
               <w:rPr>
                 <w:noProof/>
               </w:rPr>
-              <w:instrText xml:space="preserve"> PAGEREF _Toc244011612 \h </w:instrText>
+              <w:instrText xml:space="preserve"> PAGEREF _Toc244206653 \h </w:instrText>
             </w:r>
             <w:r>
               <w:rPr>
@@ -5452,7 +5472,7 @@
               <w:rPr>
                 <w:noProof/>
               </w:rPr>
-              <w:t>8</w:t>
+              <w:t>6</w:t>
             </w:r>
             <w:r>
               <w:rPr>
@@ -5477,7 +5497,7 @@
               <w14:ligatures w14:val="standardContextual"/>
             </w:rPr>
           </w:pPr>
-          <w:hyperlink w:anchor="_Toc244011613" w:history="1">
+          <w:hyperlink w:anchor="_Toc244206654" w:history="1">
             <w:r>
               <w:rPr>
                 <w:rStyle w:val="Hyperlink"/>
@@ -5501,7 +5521,7 @@
               <w:rPr>
                 <w:noProof/>
               </w:rPr>
-              <w:instrText xml:space="preserve"> PAGEREF _Toc244011613 \h </w:instrText>
+              <w:instrText xml:space="preserve"> PAGEREF _Toc244206654 \h </w:instrText>
             </w:r>
             <w:r>
               <w:rPr>
@@ -5518,7 +5538,7 @@
               <w:rPr>
                 <w:noProof/>
               </w:rPr>
-              <w:t>9</w:t>
+              <w:t>7</w:t>
             </w:r>
             <w:r>
               <w:rPr>
@@ -5543,7 +5563,7 @@
               <w14:ligatures w14:val="standardContextual"/>
             </w:rPr>
           </w:pPr>
-          <w:hyperlink w:anchor="_Toc244011614" w:history="1">
+          <w:hyperlink w:anchor="_Toc244206655" w:history="1">
             <w:r>
               <w:rPr>
                 <w:rStyle w:val="Hyperlink"/>
@@ -5567,7 +5587,7 @@
               <w:rPr>
                 <w:noProof/>
               </w:rPr>
-              <w:instrText xml:space="preserve"> PAGEREF _Toc244011614 \h </w:instrText>
+              <w:instrText xml:space="preserve"> PAGEREF _Toc244206655 \h </w:instrText>
             </w:r>
             <w:r>
               <w:rPr>
@@ -5584,7 +5604,7 @@
               <w:rPr>
                 <w:noProof/>
               </w:rPr>
-              <w:t>9</w:t>
+              <w:t>7</w:t>
             </w:r>
             <w:r>
               <w:rPr>
@@ -5609,7 +5629,7 @@
               <w14:ligatures w14:val="standardContextual"/>
             </w:rPr>
           </w:pPr>
-          <w:hyperlink w:anchor="_Toc244011615" w:history="1">
+          <w:hyperlink w:anchor="_Toc244206656" w:history="1">
             <w:r>
               <w:rPr>
                 <w:rStyle w:val="Hyperlink"/>
@@ -5633,7 +5653,7 @@
               <w:rPr>
                 <w:noProof/>
               </w:rPr>
-              <w:instrText xml:space="preserve"> PAGEREF _Toc244011615 \h </w:instrText>
+              <w:instrText xml:space="preserve"> PAGEREF _Toc244206656 \h </w:instrText>
             </w:r>
             <w:r>
               <w:rPr>
@@ -5650,7 +5670,7 @@
               <w:rPr>
                 <w:noProof/>
               </w:rPr>
-              <w:t>10</w:t>
+              <w:t>7</w:t>
             </w:r>
             <w:r>
               <w:rPr>
@@ -5675,7 +5695,7 @@
               <w14:ligatures w14:val="standardContextual"/>
             </w:rPr>
           </w:pPr>
-          <w:hyperlink w:anchor="_Toc244011616" w:history="1">
+          <w:hyperlink w:anchor="_Toc244206657" w:history="1">
             <w:r>
               <w:rPr>
                 <w:rStyle w:val="Hyperlink"/>
@@ -5699,7 +5719,7 @@
               <w:rPr>
                 <w:noProof/>
               </w:rPr>
-              <w:instrText xml:space="preserve"> PAGEREF _Toc244011616 \h </w:instrText>
+              <w:instrText xml:space="preserve"> PAGEREF _Toc244206657 \h </w:instrText>
             </w:r>
             <w:r>
               <w:rPr>
@@ -5716,7 +5736,7 @@
               <w:rPr>
                 <w:noProof/>
               </w:rPr>
-              <w:t>11</w:t>
+              <w:t>8</w:t>
             </w:r>
             <w:r>
               <w:rPr>
@@ -5741,7 +5761,7 @@
               <w14:ligatures w14:val="standardContextual"/>
             </w:rPr>
           </w:pPr>
-          <w:hyperlink w:anchor="_Toc244011617" w:history="1">
+          <w:hyperlink w:anchor="_Toc244206658" w:history="1">
             <w:r>
               <w:rPr>
                 <w:rStyle w:val="Hyperlink"/>
@@ -5765,7 +5785,7 @@
               <w:rPr>
                 <w:noProof/>
               </w:rPr>
-              <w:instrText xml:space="preserve"> PAGEREF _Toc244011617 \h </w:instrText>
+              <w:instrText xml:space="preserve"> PAGEREF _Toc244206658 \h </w:instrText>
             </w:r>
             <w:r>
               <w:rPr>
@@ -5782,7 +5802,7 @@
               <w:rPr>
                 <w:noProof/>
               </w:rPr>
-              <w:t>15</w:t>
+              <w:t>12</w:t>
             </w:r>
             <w:r>
               <w:rPr>
@@ -5807,7 +5827,7 @@
               <w14:ligatures w14:val="standardContextual"/>
             </w:rPr>
           </w:pPr>
-          <w:hyperlink w:anchor="_Toc244011618" w:history="1">
+          <w:hyperlink w:anchor="_Toc244206659" w:history="1">
             <w:r>
               <w:rPr>
                 <w:rStyle w:val="Hyperlink"/>
@@ -5831,7 +5851,7 @@
               <w:rPr>
                 <w:noProof/>
               </w:rPr>
-              <w:instrText xml:space="preserve"> PAGEREF _Toc244011618 \h </w:instrText>
+              <w:instrText xml:space="preserve"> PAGEREF _Toc244206659 \h </w:instrText>
             </w:r>
             <w:r>
               <w:rPr>
@@ -5848,7 +5868,7 @@
               <w:rPr>
                 <w:noProof/>
               </w:rPr>
-              <w:t>17</w:t>
+              <w:t>14</w:t>
             </w:r>
             <w:r>
               <w:rPr>
@@ -5873,7 +5893,7 @@
               <w14:ligatures w14:val="standardContextual"/>
             </w:rPr>
           </w:pPr>
-          <w:hyperlink w:anchor="_Toc244011619" w:history="1">
+          <w:hyperlink w:anchor="_Toc244206660" w:history="1">
             <w:r>
               <w:rPr>
                 <w:rStyle w:val="Hyperlink"/>
@@ -5897,7 +5917,7 @@
               <w:rPr>
                 <w:noProof/>
               </w:rPr>
-              <w:instrText xml:space="preserve"> PAGEREF _Toc244011619 \h </w:instrText>
+              <w:instrText xml:space="preserve"> PAGEREF _Toc244206660 \h </w:instrText>
             </w:r>
             <w:r>
               <w:rPr>
@@ -5914,7 +5934,7 @@
               <w:rPr>
                 <w:noProof/>
               </w:rPr>
-              <w:t>18</w:t>
+              <w:t>15</w:t>
             </w:r>
             <w:r>
               <w:rPr>
@@ -5939,7 +5959,7 @@
               <w14:ligatures w14:val="standardContextual"/>
             </w:rPr>
           </w:pPr>
-          <w:hyperlink w:anchor="_Toc244011620" w:history="1">
+          <w:hyperlink w:anchor="_Toc244206661" w:history="1">
             <w:r>
               <w:rPr>
                 <w:rStyle w:val="Hyperlink"/>
@@ -5963,7 +5983,7 @@
               <w:rPr>
                 <w:noProof/>
               </w:rPr>
-              <w:instrText xml:space="preserve"> PAGEREF _Toc244011620 \h </w:instrText>
+              <w:instrText xml:space="preserve"> PAGEREF _Toc244206661 \h </w:instrText>
             </w:r>
             <w:r>
               <w:rPr>
@@ -5980,7 +6000,7 @@
               <w:rPr>
                 <w:noProof/>
               </w:rPr>
-              <w:t>19</w:t>
+              <w:t>15</w:t>
             </w:r>
             <w:r>
               <w:rPr>
@@ -6005,7 +6025,7 @@
               <w14:ligatures w14:val="standardContextual"/>
             </w:rPr>
           </w:pPr>
-          <w:hyperlink w:anchor="_Toc244011621" w:history="1">
+          <w:hyperlink w:anchor="_Toc244206662" w:history="1">
             <w:r>
               <w:rPr>
                 <w:rStyle w:val="Hyperlink"/>
@@ -6029,7 +6049,7 @@
               <w:rPr>
                 <w:noProof/>
               </w:rPr>
-              <w:instrText xml:space="preserve"> PAGEREF _Toc244011621 \h </w:instrText>
+              <w:instrText xml:space="preserve"> PAGEREF _Toc244206662 \h </w:instrText>
             </w:r>
             <w:r>
               <w:rPr>
@@ -6046,7 +6066,7 @@
               <w:rPr>
                 <w:noProof/>
               </w:rPr>
-              <w:t>20</w:t>
+              <w:t>16</w:t>
             </w:r>
             <w:r>
               <w:rPr>
@@ -6071,7 +6091,7 @@
               <w14:ligatures w14:val="standardContextual"/>
             </w:rPr>
           </w:pPr>
-          <w:hyperlink w:anchor="_Toc244011622" w:history="1">
+          <w:hyperlink w:anchor="_Toc244206663" w:history="1">
             <w:r>
               <w:rPr>
                 <w:rStyle w:val="Hyperlink"/>
@@ -6095,7 +6115,7 @@
               <w:rPr>
                 <w:noProof/>
               </w:rPr>
-              <w:instrText xml:space="preserve"> PAGEREF _Toc244011622 \h </w:instrText>
+              <w:instrText xml:space="preserve"> PAGEREF _Toc244206663 \h </w:instrText>
             </w:r>
             <w:r>
               <w:rPr>
@@ -6112,7 +6132,7 @@
               <w:rPr>
                 <w:noProof/>
               </w:rPr>
-              <w:t>20</w:t>
+              <w:t>16</w:t>
             </w:r>
             <w:r>
               <w:rPr>
@@ -6137,7 +6157,7 @@
               <w14:ligatures w14:val="standardContextual"/>
             </w:rPr>
           </w:pPr>
-          <w:hyperlink w:anchor="_Toc244011623" w:history="1">
+          <w:hyperlink w:anchor="_Toc244206664" w:history="1">
             <w:r>
               <w:rPr>
                 <w:rStyle w:val="Hyperlink"/>
@@ -6161,7 +6181,7 @@
               <w:rPr>
                 <w:noProof/>
               </w:rPr>
-              <w:instrText xml:space="preserve"> PAGEREF _Toc244011623 \h </w:instrText>
+              <w:instrText xml:space="preserve"> PAGEREF _Toc244206664 \h </w:instrText>
             </w:r>
             <w:r>
               <w:rPr>
@@ -6178,7 +6198,7 @@
               <w:rPr>
                 <w:noProof/>
               </w:rPr>
-              <w:t>21</w:t>
+              <w:t>17</w:t>
             </w:r>
             <w:r>
               <w:rPr>
@@ -6203,7 +6223,7 @@
               <w14:ligatures w14:val="standardContextual"/>
             </w:rPr>
           </w:pPr>
-          <w:hyperlink w:anchor="_Toc244011624" w:history="1">
+          <w:hyperlink w:anchor="_Toc244206665" w:history="1">
             <w:r>
               <w:rPr>
                 <w:rStyle w:val="Hyperlink"/>
@@ -6227,7 +6247,7 @@
               <w:rPr>
                 <w:noProof/>
               </w:rPr>
-              <w:instrText xml:space="preserve"> PAGEREF _Toc244011624 \h </w:instrText>
+              <w:instrText xml:space="preserve"> PAGEREF _Toc244206665 \h </w:instrText>
             </w:r>
             <w:r>
               <w:rPr>
@@ -6244,7 +6264,7 @@
               <w:rPr>
                 <w:noProof/>
               </w:rPr>
-              <w:t>21</w:t>
+              <w:t>17</w:t>
             </w:r>
             <w:r>
               <w:rPr>
@@ -6269,7 +6289,7 @@
               <w14:ligatures w14:val="standardContextual"/>
             </w:rPr>
           </w:pPr>
-          <w:hyperlink w:anchor="_Toc244011625" w:history="1">
+          <w:hyperlink w:anchor="_Toc244206666" w:history="1">
             <w:r>
               <w:rPr>
                 <w:rStyle w:val="Hyperlink"/>
@@ -6293,7 +6313,7 @@
               <w:rPr>
                 <w:noProof/>
               </w:rPr>
-              <w:instrText xml:space="preserve"> PAGEREF _Toc244011625 \h </w:instrText>
+              <w:instrText xml:space="preserve"> PAGEREF _Toc244206666 \h </w:instrText>
             </w:r>
             <w:r>
               <w:rPr>
@@ -6310,7 +6330,7 @@
               <w:rPr>
                 <w:noProof/>
               </w:rPr>
-              <w:t>21</w:t>
+              <w:t>17</w:t>
             </w:r>
             <w:r>
               <w:rPr>
@@ -6335,7 +6355,7 @@
               <w14:ligatures w14:val="standardContextual"/>
             </w:rPr>
           </w:pPr>
-          <w:hyperlink w:anchor="_Toc244011626" w:history="1">
+          <w:hyperlink w:anchor="_Toc244206667" w:history="1">
             <w:r>
               <w:rPr>
                 <w:rStyle w:val="Hyperlink"/>
@@ -6359,7 +6379,7 @@
               <w:rPr>
                 <w:noProof/>
               </w:rPr>
-              <w:instrText xml:space="preserve"> PAGEREF _Toc244011626 \h </w:instrText>
+              <w:instrText xml:space="preserve"> PAGEREF _Toc244206667 \h </w:instrText>
             </w:r>
             <w:r>
               <w:rPr>
@@ -6376,7 +6396,7 @@
               <w:rPr>
                 <w:noProof/>
               </w:rPr>
-              <w:t>22</w:t>
+              <w:t>18</w:t>
             </w:r>
             <w:r>
               <w:rPr>
@@ -6401,7 +6421,7 @@
               <w14:ligatures w14:val="standardContextual"/>
             </w:rPr>
           </w:pPr>
-          <w:hyperlink w:anchor="_Toc244011627" w:history="1">
+          <w:hyperlink w:anchor="_Toc244206668" w:history="1">
             <w:r>
               <w:rPr>
                 <w:rStyle w:val="Hyperlink"/>
@@ -6425,7 +6445,7 @@
               <w:rPr>
                 <w:noProof/>
               </w:rPr>
-              <w:instrText xml:space="preserve"> PAGEREF _Toc244011627 \h </w:instrText>
+              <w:instrText xml:space="preserve"> PAGEREF _Toc244206668 \h </w:instrText>
             </w:r>
             <w:r>
               <w:rPr>
@@ -6442,7 +6462,7 @@
               <w:rPr>
                 <w:noProof/>
               </w:rPr>
-              <w:t>23</w:t>
+              <w:t>19</w:t>
             </w:r>
             <w:r>
               <w:rPr>
@@ -6467,7 +6487,7 @@
               <w14:ligatures w14:val="standardContextual"/>
             </w:rPr>
           </w:pPr>
-          <w:hyperlink w:anchor="_Toc244011628" w:history="1">
+          <w:hyperlink w:anchor="_Toc244206669" w:history="1">
             <w:r>
               <w:rPr>
                 <w:rStyle w:val="Hyperlink"/>
@@ -6491,7 +6511,7 @@
               <w:rPr>
                 <w:noProof/>
               </w:rPr>
-              <w:instrText xml:space="preserve"> PAGEREF _Toc244011628 \h </w:instrText>
+              <w:instrText xml:space="preserve"> PAGEREF _Toc244206669 \h </w:instrText>
             </w:r>
             <w:r>
               <w:rPr>
@@ -6508,7 +6528,7 @@
               <w:rPr>
                 <w:noProof/>
               </w:rPr>
-              <w:t>24</w:t>
+              <w:t>20</w:t>
             </w:r>
             <w:r>
               <w:rPr>
@@ -6533,7 +6553,7 @@
               <w14:ligatures w14:val="standardContextual"/>
             </w:rPr>
           </w:pPr>
-          <w:hyperlink w:anchor="_Toc244011629" w:history="1">
+          <w:hyperlink w:anchor="_Toc244206670" w:history="1">
             <w:r>
               <w:rPr>
                 <w:rStyle w:val="Hyperlink"/>
@@ -6557,7 +6577,7 @@
               <w:rPr>
                 <w:noProof/>
               </w:rPr>
-              <w:instrText xml:space="preserve"> PAGEREF _Toc244011629 \h </w:instrText>
+              <w:instrText xml:space="preserve"> PAGEREF _Toc244206670 \h </w:instrText>
             </w:r>
             <w:r>
               <w:rPr>
@@ -6574,73 +6594,7 @@
               <w:rPr>
                 <w:noProof/>
               </w:rPr>
-              <w:t>25</w:t>
-            </w:r>
-            <w:r>
-              <w:rPr>
-                <w:noProof/>
-              </w:rPr>
-              <w:fldChar w:fldCharType="end"/>
-            </w:r>
-          </w:hyperlink>
-        </w:p>
-        <w:p>
-          <w:pPr>
-            <w:pStyle w:val="TableofFigures"/>
-            <w:tabs>
-              <w:tab w:val="right" w:leader="dot" w:pos="9628"/>
-            </w:tabs>
-            <w:rPr>
-              <w:rFonts w:asciiTheme="minorHAnsi" w:eastAsiaTheme="minorEastAsia" w:hAnsiTheme="minorHAnsi" w:cstheme="minorBidi"/>
-              <w:noProof/>
-              <w:kern w:val="2"/>
-              <w:sz w:val="24"/>
-              <w:szCs w:val="24"/>
-              <w14:ligatures w14:val="standardContextual"/>
-            </w:rPr>
-          </w:pPr>
-          <w:hyperlink w:anchor="_Toc244011630" w:history="1">
-            <w:r>
-              <w:rPr>
-                <w:rStyle w:val="Hyperlink"/>
-                <w:noProof/>
-              </w:rPr>
-              <w:t>Table 19 – Requirement traceability matrix</w:t>
-            </w:r>
-            <w:r>
-              <w:rPr>
-                <w:noProof/>
-              </w:rPr>
-              <w:tab/>
-            </w:r>
-            <w:r>
-              <w:rPr>
-                <w:noProof/>
-              </w:rPr>
-              <w:fldChar w:fldCharType="begin"/>
-            </w:r>
-            <w:r>
-              <w:rPr>
-                <w:noProof/>
-              </w:rPr>
-              <w:instrText xml:space="preserve"> PAGEREF _Toc244011630 \h </w:instrText>
-            </w:r>
-            <w:r>
-              <w:rPr>
-                <w:noProof/>
-              </w:rPr>
-            </w:r>
-            <w:r>
-              <w:rPr>
-                <w:noProof/>
-              </w:rPr>
-              <w:fldChar w:fldCharType="separate"/>
-            </w:r>
-            <w:r>
-              <w:rPr>
-                <w:noProof/>
-              </w:rPr>
-              <w:t>26</w:t>
+              <w:t>21</w:t>
             </w:r>
             <w:r>
               <w:rPr>
@@ -7399,8 +7353,59 @@
                 <w:sz w:val="18"/>
                 <w:szCs w:val="18"/>
               </w:rPr>
+              <w:t>Archive</w:t>
+            </w:r>
+          </w:p>
+        </w:tc>
+        <w:tc>
+          <w:tcPr>
+            <w:tcW w:w="7133" w:type="dxa"/>
+            <w:tcMar>
+              <w:top w:w="60" w:type="dxa"/>
+              <w:left w:w="90" w:type="dxa"/>
+              <w:bottom w:w="60" w:type="dxa"/>
+              <w:right w:w="90" w:type="dxa"/>
+            </w:tcMar>
+          </w:tcPr>
+          <w:p>
+            <w:pPr>
+              <w:spacing w:after="30"/>
+            </w:pPr>
+            <w:r>
+              <w:rPr>
+                <w:sz w:val="18"/>
+                <w:szCs w:val="18"/>
+              </w:rPr>
+              <w:t>Parquet files in Azure Blob Storage that hold data more than three and up to eight years old.</w:t>
+            </w:r>
+          </w:p>
+        </w:tc>
+      </w:tr>
+      <w:tr>
+        <w:trPr>
+          <w:cantSplit/>
+        </w:trPr>
+        <w:tc>
+          <w:tcPr>
+            <w:tcW w:w="2505" w:type="dxa"/>
+            <w:tcMar>
+              <w:top w:w="60" w:type="dxa"/>
+              <w:left w:w="90" w:type="dxa"/>
+              <w:bottom w:w="60" w:type="dxa"/>
+              <w:right w:w="90" w:type="dxa"/>
+            </w:tcMar>
+          </w:tcPr>
+          <w:p>
+            <w:pPr>
+              <w:spacing w:after="30"/>
+            </w:pPr>
+            <w:r>
+              <w:rPr>
+                <w:sz w:val="18"/>
+                <w:szCs w:val="18"/>
+              </w:rPr>
               <w:lastRenderedPageBreak/>
-              <w:t>Archive</w:t>
+              <w:t>Archive cut-off date</w:t>
             </w:r>
           </w:p>
         </w:tc>
@@ -7423,7 +7428,7 @@
                 <w:sz w:val="18"/>
                 <w:szCs w:val="18"/>
               </w:rPr>
-              <w:t>Parquet files in Azure Blob Storage that hold data more than three and up to eight years old.</w:t>
+              <w:t>Run date minus the total retention period (default eight years). Data and archive files with a business date before this date are removed.</w:t>
             </w:r>
           </w:p>
         </w:tc>
@@ -7451,7 +7456,7 @@
                 <w:sz w:val="18"/>
                 <w:szCs w:val="18"/>
               </w:rPr>
-              <w:t>Archive cut-off date</w:t>
+              <w:t>Archived segment</w:t>
             </w:r>
           </w:p>
         </w:tc>
@@ -7474,7 +7479,7 @@
                 <w:sz w:val="18"/>
                 <w:szCs w:val="18"/>
               </w:rPr>
-              <w:t>Run date minus the total retention period (default eight years). Data and archive files with a business date before this date are removed.</w:t>
+              <w:t>Data with a business date on or after the archive cut-off date and before the DWH cut-off date. It is exported to Parquet and then deleted from the DWH.</w:t>
             </w:r>
           </w:p>
         </w:tc>
@@ -7502,7 +7507,7 @@
                 <w:sz w:val="18"/>
                 <w:szCs w:val="18"/>
               </w:rPr>
-              <w:t>Archived segment</w:t>
+              <w:t>Azure Blob Storage</w:t>
             </w:r>
           </w:p>
         </w:tc>
@@ -7525,7 +7530,7 @@
                 <w:sz w:val="18"/>
                 <w:szCs w:val="18"/>
               </w:rPr>
-              <w:t>Data with a business date on or after the archive cut-off date and before the DWH cut-off date. It is exported to Parquet and then deleted from the DWH.</w:t>
+              <w:t>Azure storage service that holds the Parquet archive files.</w:t>
             </w:r>
           </w:p>
         </w:tc>
@@ -7553,7 +7558,7 @@
                 <w:sz w:val="18"/>
                 <w:szCs w:val="18"/>
               </w:rPr>
-              <w:t>Azure Blob Storage</w:t>
+              <w:t>Azure SQL Database</w:t>
             </w:r>
           </w:p>
         </w:tc>
@@ -7576,7 +7581,7 @@
                 <w:sz w:val="18"/>
                 <w:szCs w:val="18"/>
               </w:rPr>
-              <w:t>Azure storage service that holds the Parquet archive files.</w:t>
+              <w:t>The Azure managed database service that hosts the DWH database, including schema ret.</w:t>
             </w:r>
           </w:p>
         </w:tc>
@@ -7604,7 +7609,7 @@
                 <w:sz w:val="18"/>
                 <w:szCs w:val="18"/>
               </w:rPr>
-              <w:t>Azure SQL Database</w:t>
+              <w:t>Batch delete</w:t>
             </w:r>
           </w:p>
         </w:tc>
@@ -7627,7 +7632,7 @@
                 <w:sz w:val="18"/>
                 <w:szCs w:val="18"/>
               </w:rPr>
-              <w:t>The Azure managed database service that hosts the DWH database, including schema ret.</w:t>
+              <w:t>Deleting eligible rows in repeated batches of a limited number of rows, with a short pause between batches.</w:t>
             </w:r>
           </w:p>
         </w:tc>
@@ -7655,7 +7660,7 @@
                 <w:sz w:val="18"/>
                 <w:szCs w:val="18"/>
               </w:rPr>
-              <w:t>Batch delete</w:t>
+              <w:t>Business date</w:t>
             </w:r>
           </w:p>
         </w:tc>
@@ -7678,7 +7683,23 @@
                 <w:sz w:val="18"/>
                 <w:szCs w:val="18"/>
               </w:rPr>
-              <w:t>Deleting eligible rows in repeated batches of a limited number of rows, with a short pause between batches.</w:t>
+              <w:t xml:space="preserve">The date on which the business event occurred, for example </w:t>
+            </w:r>
+            <w:proofErr w:type="spellStart"/>
+            <w:r>
+              <w:rPr>
+                <w:sz w:val="18"/>
+                <w:szCs w:val="18"/>
+              </w:rPr>
+              <w:t>dtmDate</w:t>
+            </w:r>
+            <w:proofErr w:type="spellEnd"/>
+            <w:r>
+              <w:rPr>
+                <w:sz w:val="18"/>
+                <w:szCs w:val="18"/>
+              </w:rPr>
+              <w:t>. Retention is measured against this date.</w:t>
             </w:r>
           </w:p>
         </w:tc>
@@ -7706,7 +7727,7 @@
                 <w:sz w:val="18"/>
                 <w:szCs w:val="18"/>
               </w:rPr>
-              <w:t>Business date</w:t>
+              <w:t>Configuration table</w:t>
             </w:r>
           </w:p>
         </w:tc>
@@ -7729,23 +7750,7 @@
                 <w:sz w:val="18"/>
                 <w:szCs w:val="18"/>
               </w:rPr>
-              <w:t xml:space="preserve">The date on which the business event occurred, for example </w:t>
-            </w:r>
-            <w:proofErr w:type="spellStart"/>
-            <w:r>
-              <w:rPr>
-                <w:sz w:val="18"/>
-                <w:szCs w:val="18"/>
-              </w:rPr>
-              <w:t>dtmDate</w:t>
-            </w:r>
-            <w:proofErr w:type="spellEnd"/>
-            <w:r>
-              <w:rPr>
-                <w:sz w:val="18"/>
-                <w:szCs w:val="18"/>
-              </w:rPr>
-              <w:t>. Retention is measured against this date.</w:t>
+              <w:t>Central table that defines, for each table, the settings used by the retention process (Section 7.3).</w:t>
             </w:r>
           </w:p>
         </w:tc>
@@ -7773,7 +7778,7 @@
                 <w:sz w:val="18"/>
                 <w:szCs w:val="18"/>
               </w:rPr>
-              <w:t>Configuration table</w:t>
+              <w:t>Daily Routine</w:t>
             </w:r>
           </w:p>
         </w:tc>
@@ -7796,7 +7801,23 @@
                 <w:sz w:val="18"/>
                 <w:szCs w:val="18"/>
               </w:rPr>
-              <w:t>Central table that defines, for each table, the settings used by the retention process (Section 7.3).</w:t>
+              <w:t xml:space="preserve">The scheduled daily process that archives and removes data as </w:t>
+            </w:r>
+            <w:proofErr w:type="gramStart"/>
+            <w:r>
+              <w:rPr>
+                <w:sz w:val="18"/>
+                <w:szCs w:val="18"/>
+              </w:rPr>
+              <w:t>it</w:t>
+            </w:r>
+            <w:proofErr w:type="gramEnd"/>
+            <w:r>
+              <w:rPr>
+                <w:sz w:val="18"/>
+                <w:szCs w:val="18"/>
+              </w:rPr>
+              <w:t xml:space="preserve"> ages beyond the cut-off dates. It starts on the day after the Initial Cut-off Run has been completed for all in-scope tables of the initial implementation. A table added later is included from the day after its own Initial Cut-off Run is completed.</w:t>
             </w:r>
           </w:p>
         </w:tc>
@@ -7824,7 +7845,7 @@
                 <w:sz w:val="18"/>
                 <w:szCs w:val="18"/>
               </w:rPr>
-              <w:t>Daily Routine</w:t>
+              <w:t>DWH cut-off date</w:t>
             </w:r>
           </w:p>
         </w:tc>
@@ -7847,23 +7868,7 @@
                 <w:sz w:val="18"/>
                 <w:szCs w:val="18"/>
               </w:rPr>
-              <w:t xml:space="preserve">The scheduled daily process that archives and removes data as </w:t>
-            </w:r>
-            <w:proofErr w:type="gramStart"/>
-            <w:r>
-              <w:rPr>
-                <w:sz w:val="18"/>
-                <w:szCs w:val="18"/>
-              </w:rPr>
-              <w:t>it</w:t>
-            </w:r>
-            <w:proofErr w:type="gramEnd"/>
-            <w:r>
-              <w:rPr>
-                <w:sz w:val="18"/>
-                <w:szCs w:val="18"/>
-              </w:rPr>
-              <w:t xml:space="preserve"> ages beyond the cut-off dates. It starts on the day after the Initial Cut-off Run has been completed for all in-scope tables of the initial implementation. A table added later is included from the day after its own Initial Cut-off Run is completed.</w:t>
+              <w:t>Run date minus the DWH retention period (default three years). Data with a business date before this date leaves the DWH.</w:t>
             </w:r>
           </w:p>
         </w:tc>
@@ -7891,7 +7896,7 @@
                 <w:sz w:val="18"/>
                 <w:szCs w:val="18"/>
               </w:rPr>
-              <w:t>DWH cut-off date</w:t>
+              <w:t>Execution log</w:t>
             </w:r>
           </w:p>
         </w:tc>
@@ -7914,7 +7919,7 @@
                 <w:sz w:val="18"/>
                 <w:szCs w:val="18"/>
               </w:rPr>
-              <w:t>Run date minus the DWH retention period (default three years). Data with a business date before this date leaves the DWH.</w:t>
+              <w:t>Records written to the log tables for each table and execution (Section 7.4).</w:t>
             </w:r>
           </w:p>
         </w:tc>
@@ -7942,7 +7947,7 @@
                 <w:sz w:val="18"/>
                 <w:szCs w:val="18"/>
               </w:rPr>
-              <w:t>Execution log</w:t>
+              <w:t>Expired segment</w:t>
             </w:r>
           </w:p>
         </w:tc>
@@ -7965,7 +7970,7 @@
                 <w:sz w:val="18"/>
                 <w:szCs w:val="18"/>
               </w:rPr>
-              <w:t>Records written to the log tables for each table and execution (Section 7.4).</w:t>
+              <w:t>Data with a business date before the archive cut-off date.</w:t>
             </w:r>
           </w:p>
         </w:tc>
@@ -7993,7 +7998,7 @@
                 <w:sz w:val="18"/>
                 <w:szCs w:val="18"/>
               </w:rPr>
-              <w:t>Expired segment</w:t>
+              <w:t>Hypercare</w:t>
             </w:r>
           </w:p>
         </w:tc>
@@ -8016,7 +8021,7 @@
                 <w:sz w:val="18"/>
                 <w:szCs w:val="18"/>
               </w:rPr>
-              <w:t>Data with a business date before the archive cut-off date.</w:t>
+              <w:t>The period of support after deployment, until 31 March 2027.</w:t>
             </w:r>
           </w:p>
         </w:tc>
@@ -8044,7 +8049,7 @@
                 <w:sz w:val="18"/>
                 <w:szCs w:val="18"/>
               </w:rPr>
-              <w:t>Hypercare</w:t>
+              <w:t>Initial Cut-off Run</w:t>
             </w:r>
           </w:p>
         </w:tc>
@@ -8067,7 +8072,7 @@
                 <w:sz w:val="18"/>
                 <w:szCs w:val="18"/>
               </w:rPr>
-              <w:t>The period of support after deployment, until 31 March 2027.</w:t>
+              <w:t>Initial implementation (cut-off): the process, executed once for each in-scope table, that archives historical data and removes data beyond the retention period. It is executed for all in-scope tables during the initial implementation, and for each table added to the configuration table later, before that table enters the Daily Routine.</w:t>
             </w:r>
           </w:p>
         </w:tc>
@@ -8095,7 +8100,7 @@
                 <w:sz w:val="18"/>
                 <w:szCs w:val="18"/>
               </w:rPr>
-              <w:t>Initial Cut-off Run</w:t>
+              <w:t>Integration Runtime</w:t>
             </w:r>
           </w:p>
         </w:tc>
@@ -8118,7 +8123,7 @@
                 <w:sz w:val="18"/>
                 <w:szCs w:val="18"/>
               </w:rPr>
-              <w:t>Initial implementation (cut-off): the process, executed once for each in-scope table, that archives historical data and removes data beyond the retention period. It is executed for all in-scope tables during the initial implementation, and for each table added to the configuration table later, before that table enters the Daily Routine.</w:t>
+              <w:t>The ADF component that provides connectivity between ADF and the data stores. It is provided by the Customer infrastructure team.</w:t>
             </w:r>
           </w:p>
         </w:tc>
@@ -8146,7 +8151,7 @@
                 <w:sz w:val="18"/>
                 <w:szCs w:val="18"/>
               </w:rPr>
-              <w:t>Integration Runtime</w:t>
+              <w:t>Parquet</w:t>
             </w:r>
           </w:p>
         </w:tc>
@@ -8169,7 +8174,7 @@
                 <w:sz w:val="18"/>
                 <w:szCs w:val="18"/>
               </w:rPr>
-              <w:t>The ADF component that provides connectivity between ADF and the data stores. It is provided by the Customer infrastructure team.</w:t>
+              <w:t>Columnar file format used for the archive files.</w:t>
             </w:r>
           </w:p>
         </w:tc>
@@ -8197,7 +8202,7 @@
                 <w:sz w:val="18"/>
                 <w:szCs w:val="18"/>
               </w:rPr>
-              <w:t>Parquet</w:t>
+              <w:t>Retained segment</w:t>
             </w:r>
           </w:p>
         </w:tc>
@@ -8220,7 +8225,7 @@
                 <w:sz w:val="18"/>
                 <w:szCs w:val="18"/>
               </w:rPr>
-              <w:t>Columnar file format used for the archive files.</w:t>
+              <w:t>Data with a business date on or after the DWH cut-off date. It stays in the DWH.</w:t>
             </w:r>
           </w:p>
         </w:tc>
@@ -8248,7 +8253,7 @@
                 <w:sz w:val="18"/>
                 <w:szCs w:val="18"/>
               </w:rPr>
-              <w:t>Retained segment</w:t>
+              <w:t>Retention column</w:t>
             </w:r>
           </w:p>
         </w:tc>
@@ -8271,7 +8276,7 @@
                 <w:sz w:val="18"/>
                 <w:szCs w:val="18"/>
               </w:rPr>
-              <w:t>Data with a business date on or after the DWH cut-off date. It stays in the DWH.</w:t>
+              <w:t>The business date column of a table, registered in the configuration table. It must be of a date or datetime data type and must not contain NULL values.</w:t>
             </w:r>
           </w:p>
         </w:tc>
@@ -8299,7 +8304,7 @@
                 <w:sz w:val="18"/>
                 <w:szCs w:val="18"/>
               </w:rPr>
-              <w:t>Retention column</w:t>
+              <w:t>Retention period</w:t>
             </w:r>
           </w:p>
         </w:tc>
@@ -8322,7 +8327,7 @@
                 <w:sz w:val="18"/>
                 <w:szCs w:val="18"/>
               </w:rPr>
-              <w:t>The business date column of a table, registered in the configuration table. It must be of a date or datetime data type and must not contain NULL values.</w:t>
+              <w:t>The number of years data is kept: the DWH retention period (default three years) and the total retention period covering the DWH and the archive (default eight years: three years in the DWH and five years in Azure Blob Storage).</w:t>
             </w:r>
           </w:p>
         </w:tc>
@@ -8350,7 +8355,7 @@
                 <w:sz w:val="18"/>
                 <w:szCs w:val="18"/>
               </w:rPr>
-              <w:t>Retention period</w:t>
+              <w:t>Rolling window</w:t>
             </w:r>
           </w:p>
         </w:tc>
@@ -8373,7 +8378,7 @@
                 <w:sz w:val="18"/>
                 <w:szCs w:val="18"/>
               </w:rPr>
-              <w:t>The number of years data is kept: the DWH retention period (default three years) and the total retention period covering the DWH and the archive (default eight years: three years in the DWH and five years in Azure Blob Storage).</w:t>
+              <w:t>A retention window that is recalculated relative to the run date on every daily run.</w:t>
             </w:r>
           </w:p>
         </w:tc>
@@ -8401,7 +8406,7 @@
                 <w:sz w:val="18"/>
                 <w:szCs w:val="18"/>
               </w:rPr>
-              <w:t>Rolling window</w:t>
+              <w:t>Row-count validation</w:t>
             </w:r>
           </w:p>
         </w:tc>
@@ -8424,7 +8429,7 @@
                 <w:sz w:val="18"/>
                 <w:szCs w:val="18"/>
               </w:rPr>
-              <w:t>A retention window that is recalculated relative to the run date on every daily run.</w:t>
+              <w:t>Comparison of the number of rows in the Parquet files with the number of rows in the DWH for the same data, performed before any data is removed from the DWH.</w:t>
             </w:r>
           </w:p>
         </w:tc>
@@ -8452,7 +8457,7 @@
                 <w:sz w:val="18"/>
                 <w:szCs w:val="18"/>
               </w:rPr>
-              <w:t>Row-count validation</w:t>
+              <w:t>Run date</w:t>
             </w:r>
           </w:p>
         </w:tc>
@@ -8475,7 +8480,7 @@
                 <w:sz w:val="18"/>
                 <w:szCs w:val="18"/>
               </w:rPr>
-              <w:t>Comparison of the number of rows in the Parquet files with the number of rows in the DWH for the same data, performed before any data is removed from the DWH.</w:t>
+              <w:t>The current date in UTC+7 at the time of execution.</w:t>
             </w:r>
           </w:p>
         </w:tc>
@@ -8503,7 +8508,7 @@
                 <w:sz w:val="18"/>
                 <w:szCs w:val="18"/>
               </w:rPr>
-              <w:t>Run date</w:t>
+              <w:t>Schema ret</w:t>
             </w:r>
           </w:p>
         </w:tc>
@@ -8526,7 +8531,7 @@
                 <w:sz w:val="18"/>
                 <w:szCs w:val="18"/>
               </w:rPr>
-              <w:t>The current date in UTC+7 at the time of execution.</w:t>
+              <w:t>The database schema in the DWH database that holds the configuration table, log tables, and stored procedures of the retention solution.</w:t>
             </w:r>
           </w:p>
         </w:tc>
@@ -8554,7 +8559,7 @@
                 <w:sz w:val="18"/>
                 <w:szCs w:val="18"/>
               </w:rPr>
-              <w:t>Schema ret</w:t>
+              <w:t>Stored procedure</w:t>
             </w:r>
           </w:p>
         </w:tc>
@@ -8577,7 +8582,7 @@
                 <w:sz w:val="18"/>
                 <w:szCs w:val="18"/>
               </w:rPr>
-              <w:t>The database schema in the DWH database that holds the configuration table, log tables, and stored procedures of the retention solution.</w:t>
+              <w:t>A program stored in the DWH database under schema ret that implements part of the retention logic.</w:t>
             </w:r>
           </w:p>
         </w:tc>
@@ -8605,7 +8610,7 @@
                 <w:sz w:val="18"/>
                 <w:szCs w:val="18"/>
               </w:rPr>
-              <w:t>Stored procedure</w:t>
+              <w:t>Table rebuild</w:t>
             </w:r>
           </w:p>
         </w:tc>
@@ -8628,7 +8633,7 @@
                 <w:sz w:val="18"/>
                 <w:szCs w:val="18"/>
               </w:rPr>
-              <w:t>A program stored in the DWH database under schema ret that implements part of the retention logic.</w:t>
+              <w:t>Creating a new table that contains only the retained data and using it to replace the original table.</w:t>
             </w:r>
           </w:p>
         </w:tc>
@@ -8649,57 +8654,6 @@
           </w:tcPr>
           <w:p>
             <w:pPr>
-              <w:spacing w:after="30"/>
-            </w:pPr>
-            <w:r>
-              <w:rPr>
-                <w:sz w:val="18"/>
-                <w:szCs w:val="18"/>
-              </w:rPr>
-              <w:t>Table rebuild</w:t>
-            </w:r>
-          </w:p>
-        </w:tc>
-        <w:tc>
-          <w:tcPr>
-            <w:tcW w:w="7133" w:type="dxa"/>
-            <w:tcMar>
-              <w:top w:w="60" w:type="dxa"/>
-              <w:left w:w="90" w:type="dxa"/>
-              <w:bottom w:w="60" w:type="dxa"/>
-              <w:right w:w="90" w:type="dxa"/>
-            </w:tcMar>
-          </w:tcPr>
-          <w:p>
-            <w:pPr>
-              <w:spacing w:after="30"/>
-            </w:pPr>
-            <w:r>
-              <w:rPr>
-                <w:sz w:val="18"/>
-                <w:szCs w:val="18"/>
-              </w:rPr>
-              <w:t>Creating a new table that contains only the retained data and using it to replace the original table.</w:t>
-            </w:r>
-          </w:p>
-        </w:tc>
-      </w:tr>
-      <w:tr>
-        <w:trPr>
-          <w:cantSplit/>
-        </w:trPr>
-        <w:tc>
-          <w:tcPr>
-            <w:tcW w:w="2505" w:type="dxa"/>
-            <w:tcMar>
-              <w:top w:w="60" w:type="dxa"/>
-              <w:left w:w="90" w:type="dxa"/>
-              <w:bottom w:w="60" w:type="dxa"/>
-              <w:right w:w="90" w:type="dxa"/>
-            </w:tcMar>
-          </w:tcPr>
-          <w:p>
-            <w:pPr>
               <w:keepNext/>
               <w:spacing w:after="30"/>
             </w:pPr>
@@ -8708,7 +8662,6 @@
                 <w:sz w:val="18"/>
                 <w:szCs w:val="18"/>
               </w:rPr>
-              <w:lastRenderedPageBreak/>
               <w:t>Technical assessment</w:t>
             </w:r>
           </w:p>
@@ -9197,7 +9150,7 @@
         <w:spacing w:before="80" w:after="200"/>
         <w:jc w:val="center"/>
       </w:pPr>
-      <w:bookmarkStart w:id="8" w:name="_Toc244011612"/>
+      <w:bookmarkStart w:id="8" w:name="_Toc244206653"/>
       <w:r>
         <w:t xml:space="preserve">Table </w:t>
       </w:r>
@@ -10044,7 +9997,7 @@
         <w:spacing w:before="80" w:after="200"/>
         <w:jc w:val="center"/>
       </w:pPr>
-      <w:bookmarkStart w:id="12" w:name="_Toc244011613"/>
+      <w:bookmarkStart w:id="12" w:name="_Toc244206654"/>
       <w:r>
         <w:t xml:space="preserve">Table </w:t>
       </w:r>
@@ -10584,7 +10537,7 @@
         <w:spacing w:before="80" w:after="200"/>
         <w:jc w:val="center"/>
       </w:pPr>
-      <w:bookmarkStart w:id="14" w:name="_Toc244011614"/>
+      <w:bookmarkStart w:id="14" w:name="_Toc244206655"/>
       <w:r>
         <w:t xml:space="preserve">Table </w:t>
       </w:r>
@@ -11352,7 +11305,7 @@
         <w:spacing w:before="80" w:after="200"/>
         <w:jc w:val="center"/>
       </w:pPr>
-      <w:bookmarkStart w:id="16" w:name="_Toc244011615"/>
+      <w:bookmarkStart w:id="16" w:name="_Toc244206656"/>
       <w:r>
         <w:t xml:space="preserve">Table </w:t>
       </w:r>
@@ -12000,7 +11953,7 @@
         <w:spacing w:before="80" w:after="200"/>
         <w:jc w:val="center"/>
       </w:pPr>
-      <w:bookmarkStart w:id="21" w:name="_Toc244011616"/>
+      <w:bookmarkStart w:id="21" w:name="_Toc244206657"/>
       <w:r>
         <w:t xml:space="preserve">Table </w:t>
       </w:r>
@@ -12121,7 +12074,7 @@
         <w:spacing w:after="200"/>
         <w:jc w:val="center"/>
       </w:pPr>
-      <w:bookmarkStart w:id="23" w:name="_Toc244011608"/>
+      <w:bookmarkStart w:id="23" w:name="_Toc244206671"/>
       <w:r>
         <w:t xml:space="preserve">Figure </w:t>
       </w:r>
@@ -12254,7 +12207,7 @@
         <w:spacing w:after="200"/>
         <w:jc w:val="center"/>
       </w:pPr>
-      <w:bookmarkStart w:id="25" w:name="_Toc244011609"/>
+      <w:bookmarkStart w:id="25" w:name="_Toc244206672"/>
       <w:r>
         <w:t xml:space="preserve">Figure </w:t>
       </w:r>
@@ -12465,7 +12418,7 @@
         <w:spacing w:after="200"/>
         <w:jc w:val="center"/>
       </w:pPr>
-      <w:bookmarkStart w:id="29" w:name="_Toc244011610"/>
+      <w:bookmarkStart w:id="29" w:name="_Toc244206673"/>
       <w:r>
         <w:t xml:space="preserve">Figure </w:t>
       </w:r>
@@ -12978,7 +12931,7 @@
         <w:spacing w:before="80" w:after="200"/>
         <w:jc w:val="center"/>
       </w:pPr>
-      <w:bookmarkStart w:id="30" w:name="_Toc244011617"/>
+      <w:bookmarkStart w:id="30" w:name="_Toc244206658"/>
       <w:r>
         <w:t xml:space="preserve">Table </w:t>
       </w:r>
@@ -13079,7 +13032,7 @@
         <w:spacing w:after="200"/>
         <w:jc w:val="center"/>
       </w:pPr>
-      <w:bookmarkStart w:id="32" w:name="_Toc244011611"/>
+      <w:bookmarkStart w:id="32" w:name="_Toc244206674"/>
       <w:r>
         <w:t xml:space="preserve">Figure </w:t>
       </w:r>
@@ -13667,7 +13620,7 @@
         <w:spacing w:before="80" w:after="200"/>
         <w:jc w:val="center"/>
       </w:pPr>
-      <w:bookmarkStart w:id="33" w:name="_Toc244011618"/>
+      <w:bookmarkStart w:id="33" w:name="_Toc244206659"/>
       <w:r>
         <w:t xml:space="preserve">Table </w:t>
       </w:r>
@@ -14718,7 +14671,7 @@
         <w:spacing w:before="80" w:after="200"/>
         <w:jc w:val="center"/>
       </w:pPr>
-      <w:bookmarkStart w:id="35" w:name="_Toc244011619"/>
+      <w:bookmarkStart w:id="35" w:name="_Toc244206660"/>
       <w:r>
         <w:t xml:space="preserve">Table </w:t>
       </w:r>
@@ -15793,7 +15746,7 @@
         <w:spacing w:before="80" w:after="200"/>
         <w:jc w:val="center"/>
       </w:pPr>
-      <w:bookmarkStart w:id="38" w:name="_Toc244011620"/>
+      <w:bookmarkStart w:id="38" w:name="_Toc244206661"/>
       <w:r>
         <w:t xml:space="preserve">Table </w:t>
       </w:r>
@@ -16334,7 +16287,7 @@
         <w:spacing w:before="80" w:after="200"/>
         <w:jc w:val="center"/>
       </w:pPr>
-      <w:bookmarkStart w:id="40" w:name="_Toc244011621"/>
+      <w:bookmarkStart w:id="40" w:name="_Toc244206662"/>
       <w:r>
         <w:t xml:space="preserve">Table </w:t>
       </w:r>
@@ -17172,7 +17125,7 @@
         <w:spacing w:before="80" w:after="200"/>
         <w:jc w:val="center"/>
       </w:pPr>
-      <w:bookmarkStart w:id="42" w:name="_Toc244011622"/>
+      <w:bookmarkStart w:id="42" w:name="_Toc244206663"/>
       <w:r>
         <w:t xml:space="preserve">Table </w:t>
       </w:r>
@@ -17587,7 +17540,7 @@
         <w:spacing w:before="80" w:after="200"/>
         <w:jc w:val="center"/>
       </w:pPr>
-      <w:bookmarkStart w:id="46" w:name="_Toc244011623"/>
+      <w:bookmarkStart w:id="46" w:name="_Toc244206664"/>
       <w:r>
         <w:t xml:space="preserve">Table </w:t>
       </w:r>
@@ -17974,7 +17927,7 @@
         <w:spacing w:before="80" w:after="200"/>
         <w:jc w:val="center"/>
       </w:pPr>
-      <w:bookmarkStart w:id="48" w:name="_Toc244011624"/>
+      <w:bookmarkStart w:id="48" w:name="_Toc244206665"/>
       <w:r>
         <w:t xml:space="preserve">Table </w:t>
       </w:r>
@@ -18652,7 +18605,7 @@
         <w:spacing w:before="80" w:after="200"/>
         <w:jc w:val="center"/>
       </w:pPr>
-      <w:bookmarkStart w:id="50" w:name="_Toc244011625"/>
+      <w:bookmarkStart w:id="50" w:name="_Toc244206666"/>
       <w:r>
         <w:t xml:space="preserve">Table </w:t>
       </w:r>
@@ -20335,7 +20288,7 @@
         <w:spacing w:before="80" w:after="200"/>
         <w:jc w:val="center"/>
       </w:pPr>
-      <w:bookmarkStart w:id="52" w:name="_Toc244011626"/>
+      <w:bookmarkStart w:id="52" w:name="_Toc244206667"/>
       <w:r>
         <w:t xml:space="preserve">Table </w:t>
       </w:r>
@@ -21702,7 +21655,7 @@
         <w:spacing w:before="80" w:after="200"/>
         <w:jc w:val="center"/>
       </w:pPr>
-      <w:bookmarkStart w:id="55" w:name="_Toc244011627"/>
+      <w:bookmarkStart w:id="55" w:name="_Toc244206668"/>
       <w:r>
         <w:t xml:space="preserve">Table </w:t>
       </w:r>
@@ -22146,7 +22099,7 @@
         <w:spacing w:before="80" w:after="200"/>
         <w:jc w:val="center"/>
       </w:pPr>
-      <w:bookmarkStart w:id="57" w:name="_Toc244011628"/>
+      <w:bookmarkStart w:id="57" w:name="_Toc244206669"/>
       <w:r>
         <w:t xml:space="preserve">Table </w:t>
       </w:r>
@@ -23426,7 +23379,7 @@
         <w:spacing w:before="80" w:after="200"/>
         <w:jc w:val="center"/>
       </w:pPr>
-      <w:bookmarkStart w:id="58" w:name="_Toc244011629"/>
+      <w:bookmarkStart w:id="58" w:name="_Toc244206670"/>
       <w:r>
         <w:t xml:space="preserve">Table </w:t>
       </w:r>

</xml_diff>